<commit_message>
Change the font and formatting
</commit_message>
<xml_diff>
--- a/Experiment_1/Experiment_1_Report.docx
+++ b/Experiment_1/Experiment_1_Report.docx
@@ -925,16 +925,26 @@
           <w:kern w:val="0"/>
           <w:szCs w:val="21"/>
         </w:rPr>
-        <w:t xml:space="preserve"> Simulate a coin toss experiment to visually verify how empirical frequencies converge to theoretical probabilities.</w:t>
-      </w:r>
+        <w:t xml:space="preserve"> Simulate a coin toss experiment to visually verify how empirical frequencies converge to theoretical </w:t>
+      </w:r>
+      <w:proofErr w:type="gramStart"/>
       <w:r>
         <w:rPr>
           <w:rFonts w:ascii="Times New Roman" w:eastAsia="宋体" w:hAnsi="Times New Roman" w:cs="Times New Roman"/>
           <w:kern w:val="0"/>
           <w:szCs w:val="21"/>
         </w:rPr>
+        <w:t>probabilities.</w:t>
+      </w:r>
+      <w:r>
+        <w:rPr>
+          <w:rFonts w:ascii="Times New Roman" w:eastAsia="宋体" w:hAnsi="Times New Roman" w:cs="Times New Roman"/>
+          <w:kern w:val="0"/>
+          <w:szCs w:val="21"/>
+        </w:rPr>
         <w:t>.</w:t>
       </w:r>
+      <w:proofErr w:type="gramEnd"/>
     </w:p>
     <w:p>
       <w:pPr>
@@ -1501,8 +1511,16 @@
         <w:rPr>
           <w:rFonts w:ascii="Times New Roman" w:hAnsi="Times New Roman" w:cs="Times New Roman" w:hint="eastAsia"/>
         </w:rPr>
-        <w:t>Generate 10000 coin</w:t>
-      </w:r>
+        <w:t xml:space="preserve">Generate </w:t>
+      </w:r>
+      <w:proofErr w:type="gramStart"/>
+      <w:r>
+        <w:rPr>
+          <w:rFonts w:ascii="Times New Roman" w:hAnsi="Times New Roman" w:cs="Times New Roman" w:hint="eastAsia"/>
+        </w:rPr>
+        <w:t>10000 coin</w:t>
+      </w:r>
+      <w:proofErr w:type="gramEnd"/>
       <w:r>
         <w:rPr>
           <w:rFonts w:ascii="Times New Roman" w:hAnsi="Times New Roman" w:cs="Times New Roman" w:hint="eastAsia"/>
@@ -1643,8 +1661,16 @@
         <w:rPr>
           <w:rFonts w:ascii="Times New Roman" w:hAnsi="Times New Roman" w:cs="Times New Roman" w:hint="eastAsia"/>
         </w:rPr>
-        <w:t>(X) vs freq</w:t>
-      </w:r>
+        <w:t xml:space="preserve">(X) vs </w:t>
+      </w:r>
+      <w:proofErr w:type="spellStart"/>
+      <w:r>
+        <w:rPr>
+          <w:rFonts w:ascii="Times New Roman" w:hAnsi="Times New Roman" w:cs="Times New Roman" w:hint="eastAsia"/>
+        </w:rPr>
+        <w:t>freq</w:t>
+      </w:r>
+      <w:proofErr w:type="spellEnd"/>
       <w:r>
         <w:rPr>
           <w:rFonts w:ascii="Times New Roman" w:hAnsi="Times New Roman" w:cs="Times New Roman" w:hint="eastAsia"/>
@@ -5193,13 +5219,16 @@
         <w:pStyle w:val="ad"/>
         <w:kinsoku w:val="0"/>
         <w:spacing w:line="360" w:lineRule="auto"/>
-        <w:ind w:left="1080"/>
+        <w:ind w:left="1080" w:firstLineChars="200" w:firstLine="420"/>
         <w:jc w:val="both"/>
         <w:rPr>
-          <w:rFonts w:eastAsiaTheme="minorEastAsia"/>
-        </w:rPr>
-      </w:pPr>
-      <w:r>
+          <w:rFonts w:ascii="Times New Roman" w:eastAsiaTheme="minorEastAsia" w:hAnsi="Times New Roman" w:cs="Times New Roman"/>
+        </w:rPr>
+      </w:pPr>
+      <w:r>
+        <w:rPr>
+          <w:rFonts w:ascii="Times New Roman" w:hAnsi="Times New Roman" w:cs="Times New Roman"/>
+        </w:rPr>
         <w:t>From the coin toss graph, the cumulative frequency fluctuated very strongly at the beginning. After about n = 1000 to 2000 tosses, the line stopped wildly fluctuating and began to stabilize near the theoretical probability 0.5. Although there were still small fluctuations later, the overall trend became much smoother and closer to 0.5 as the number of trials increased.</w:t>
       </w:r>
     </w:p>
@@ -5257,12 +5286,15 @@
         <w:pStyle w:val="ad"/>
         <w:kinsoku w:val="0"/>
         <w:spacing w:line="360" w:lineRule="auto"/>
-        <w:ind w:left="1080"/>
-        <w:rPr>
-          <w:rFonts w:eastAsiaTheme="minorEastAsia"/>
-        </w:rPr>
-      </w:pPr>
-      <w:r>
+        <w:ind w:left="1080" w:firstLineChars="200" w:firstLine="420"/>
+        <w:rPr>
+          <w:rFonts w:ascii="Times New Roman" w:eastAsiaTheme="minorEastAsia" w:hAnsi="Times New Roman" w:cs="Times New Roman"/>
+        </w:rPr>
+      </w:pPr>
+      <w:r>
+        <w:rPr>
+          <w:rFonts w:ascii="Times New Roman" w:hAnsi="Times New Roman" w:cs="Times New Roman"/>
+        </w:rPr>
         <w:t>The simulated win rates were:</w:t>
       </w:r>
     </w:p>
@@ -5271,9 +5303,15 @@
         <w:pStyle w:val="ad"/>
         <w:kinsoku w:val="0"/>
         <w:spacing w:line="360" w:lineRule="auto"/>
-        <w:ind w:left="1080"/>
-      </w:pPr>
-      <w:r>
+        <w:ind w:left="1080" w:firstLineChars="200" w:firstLine="420"/>
+        <w:rPr>
+          <w:rFonts w:ascii="Times New Roman" w:hAnsi="Times New Roman" w:cs="Times New Roman"/>
+        </w:rPr>
+      </w:pPr>
+      <w:r>
+        <w:rPr>
+          <w:rFonts w:ascii="Times New Roman" w:hAnsi="Times New Roman" w:cs="Times New Roman"/>
+        </w:rPr>
         <w:t>Win rate if staying: 0.3284, or 32.84%</w:t>
       </w:r>
     </w:p>
@@ -5282,12 +5320,15 @@
         <w:pStyle w:val="ad"/>
         <w:kinsoku w:val="0"/>
         <w:spacing w:line="360" w:lineRule="auto"/>
-        <w:ind w:left="1080"/>
-        <w:rPr>
-          <w:rFonts w:eastAsiaTheme="minorEastAsia"/>
-        </w:rPr>
-      </w:pPr>
-      <w:r>
+        <w:ind w:left="1080" w:firstLineChars="200" w:firstLine="420"/>
+        <w:rPr>
+          <w:rFonts w:ascii="Times New Roman" w:eastAsiaTheme="minorEastAsia" w:hAnsi="Times New Roman" w:cs="Times New Roman"/>
+        </w:rPr>
+      </w:pPr>
+      <w:r>
+        <w:rPr>
+          <w:rFonts w:ascii="Times New Roman" w:hAnsi="Times New Roman" w:cs="Times New Roman"/>
+        </w:rPr>
         <w:t>Win rate if switching: 0.6716, or 67.16%</w:t>
       </w:r>
     </w:p>
@@ -5296,13 +5337,16 @@
         <w:pStyle w:val="ad"/>
         <w:kinsoku w:val="0"/>
         <w:spacing w:line="360" w:lineRule="auto"/>
-        <w:ind w:left="1080"/>
+        <w:ind w:left="1080" w:firstLineChars="200" w:firstLine="420"/>
         <w:jc w:val="both"/>
         <w:rPr>
-          <w:rFonts w:eastAsiaTheme="minorEastAsia"/>
-        </w:rPr>
-      </w:pPr>
-      <w:r>
+          <w:rFonts w:ascii="Times New Roman" w:eastAsiaTheme="minorEastAsia" w:hAnsi="Times New Roman" w:cs="Times New Roman"/>
+        </w:rPr>
+      </w:pPr>
+      <w:r>
+        <w:rPr>
+          <w:rFonts w:ascii="Times New Roman" w:hAnsi="Times New Roman" w:cs="Times New Roman"/>
+        </w:rPr>
         <w:t>These results match the theoretical probabilities very well. The probability of winning the car is about 1/3 if the player stays, and about 2/3 if the player switches. Therefore, the simulation supports the conclusion that switching is a better strategy in the Monty Hall problem.</w:t>
       </w:r>
     </w:p>
@@ -5336,12 +5380,15 @@
         <w:pStyle w:val="ad"/>
         <w:kinsoku w:val="0"/>
         <w:spacing w:line="360" w:lineRule="auto"/>
-        <w:ind w:left="1080"/>
-        <w:rPr>
-          <w:rFonts w:eastAsiaTheme="minorEastAsia"/>
-        </w:rPr>
-      </w:pPr>
-      <w:r>
+        <w:ind w:left="1080" w:firstLineChars="200" w:firstLine="420"/>
+        <w:rPr>
+          <w:rFonts w:ascii="Times New Roman" w:eastAsiaTheme="minorEastAsia" w:hAnsi="Times New Roman" w:cs="Times New Roman"/>
+        </w:rPr>
+      </w:pPr>
+      <w:r>
+        <w:rPr>
+          <w:rFonts w:ascii="Times New Roman" w:hAnsi="Times New Roman" w:cs="Times New Roman"/>
+        </w:rPr>
         <w:t>The results were:</w:t>
       </w:r>
     </w:p>
@@ -5350,12 +5397,15 @@
         <w:pStyle w:val="ad"/>
         <w:kinsoku w:val="0"/>
         <w:spacing w:line="360" w:lineRule="auto"/>
-        <w:ind w:left="1080"/>
-        <w:rPr>
-          <w:rFonts w:eastAsiaTheme="minorEastAsia"/>
-        </w:rPr>
-      </w:pPr>
-      <w:r>
+        <w:ind w:left="1080" w:firstLineChars="200" w:firstLine="420"/>
+        <w:rPr>
+          <w:rFonts w:ascii="Times New Roman" w:eastAsiaTheme="minorEastAsia" w:hAnsi="Times New Roman" w:cs="Times New Roman"/>
+        </w:rPr>
+      </w:pPr>
+      <w:r>
+        <w:rPr>
+          <w:rFonts w:ascii="Times New Roman" w:hAnsi="Times New Roman" w:cs="Times New Roman"/>
+        </w:rPr>
         <w:t>Simulated reliability: 0.98420</w:t>
       </w:r>
     </w:p>
@@ -5364,12 +5414,15 @@
         <w:pStyle w:val="ad"/>
         <w:kinsoku w:val="0"/>
         <w:spacing w:line="360" w:lineRule="auto"/>
-        <w:ind w:left="1080"/>
-        <w:rPr>
-          <w:rFonts w:eastAsiaTheme="minorEastAsia"/>
-        </w:rPr>
-      </w:pPr>
-      <w:r>
+        <w:ind w:left="1080" w:firstLineChars="200" w:firstLine="420"/>
+        <w:rPr>
+          <w:rFonts w:ascii="Times New Roman" w:eastAsiaTheme="minorEastAsia" w:hAnsi="Times New Roman" w:cs="Times New Roman"/>
+        </w:rPr>
+      </w:pPr>
+      <w:r>
+        <w:rPr>
+          <w:rFonts w:ascii="Times New Roman" w:hAnsi="Times New Roman" w:cs="Times New Roman"/>
+        </w:rPr>
         <w:t>Theoretical reliability: 0.98383</w:t>
       </w:r>
     </w:p>
@@ -5378,12 +5431,15 @@
         <w:pStyle w:val="ad"/>
         <w:kinsoku w:val="0"/>
         <w:spacing w:line="360" w:lineRule="auto"/>
-        <w:ind w:left="1080"/>
-        <w:rPr>
-          <w:rFonts w:eastAsiaTheme="minorEastAsia"/>
-        </w:rPr>
-      </w:pPr>
-      <w:r>
+        <w:ind w:left="1080" w:firstLineChars="200" w:firstLine="420"/>
+        <w:rPr>
+          <w:rFonts w:ascii="Times New Roman" w:eastAsiaTheme="minorEastAsia" w:hAnsi="Times New Roman" w:cs="Times New Roman"/>
+        </w:rPr>
+      </w:pPr>
+      <w:r>
+        <w:rPr>
+          <w:rFonts w:ascii="Times New Roman" w:hAnsi="Times New Roman" w:cs="Times New Roman"/>
+        </w:rPr>
         <w:t>Absolute difference: 0.00037</w:t>
       </w:r>
     </w:p>
@@ -5392,13 +5448,16 @@
         <w:pStyle w:val="ad"/>
         <w:kinsoku w:val="0"/>
         <w:spacing w:line="360" w:lineRule="auto"/>
-        <w:ind w:left="1080"/>
+        <w:ind w:left="1080" w:firstLineChars="200" w:firstLine="420"/>
         <w:jc w:val="both"/>
         <w:rPr>
-          <w:rFonts w:eastAsiaTheme="minorEastAsia"/>
-        </w:rPr>
-      </w:pPr>
-      <w:r>
+          <w:rFonts w:ascii="Times New Roman" w:eastAsiaTheme="minorEastAsia" w:hAnsi="Times New Roman" w:cs="Times New Roman"/>
+        </w:rPr>
+      </w:pPr>
+      <w:r>
+        <w:rPr>
+          <w:rFonts w:ascii="Times New Roman" w:hAnsi="Times New Roman" w:cs="Times New Roman"/>
+        </w:rPr>
         <w:t>The simulated result is very close to the theoretical result, so the simulation is successful. Parallel branches use OR logic, which means the whole system can still work as long as at least one branch works. The system fails only when all branches fail at the same time. Since this probability is much smaller than the failure probability of a single component, the whole system becomes more reliable than any single component.</w:t>
       </w:r>
     </w:p>
@@ -5481,12 +5540,15 @@
         <w:pStyle w:val="ad"/>
         <w:kinsoku w:val="0"/>
         <w:spacing w:line="360" w:lineRule="auto"/>
-        <w:ind w:left="1080"/>
-        <w:rPr>
-          <w:rFonts w:eastAsiaTheme="minorEastAsia"/>
-        </w:rPr>
-      </w:pPr>
-      <w:r>
+        <w:ind w:left="1080" w:firstLineChars="200" w:firstLine="420"/>
+        <w:rPr>
+          <w:rFonts w:ascii="Times New Roman" w:eastAsiaTheme="minorEastAsia" w:hAnsi="Times New Roman" w:cs="Times New Roman"/>
+        </w:rPr>
+      </w:pPr>
+      <w:r>
+        <w:rPr>
+          <w:rFonts w:ascii="Times New Roman" w:hAnsi="Times New Roman" w:cs="Times New Roman"/>
+        </w:rPr>
         <w:t>The results were:</w:t>
       </w:r>
     </w:p>
@@ -5495,19 +5557,16 @@
         <w:pStyle w:val="ad"/>
         <w:kinsoku w:val="0"/>
         <w:spacing w:line="360" w:lineRule="auto"/>
-        <w:ind w:left="1080"/>
-        <w:rPr>
-          <w:rFonts w:eastAsiaTheme="minorEastAsia"/>
-        </w:rPr>
-      </w:pPr>
-      <w:r>
-        <w:t xml:space="preserve">Simulated </w:t>
-      </w:r>
-      <w:r>
-        <w:rPr>
-          <w:rFonts w:hint="eastAsia"/>
-        </w:rPr>
-        <w:t>P(D</w:t>
+        <w:ind w:left="1080" w:firstLineChars="200" w:firstLine="420"/>
+        <w:rPr>
+          <w:rFonts w:ascii="Times New Roman" w:eastAsiaTheme="minorEastAsia" w:hAnsi="Times New Roman" w:cs="Times New Roman"/>
+        </w:rPr>
+      </w:pPr>
+      <w:r>
+        <w:rPr>
+          <w:rFonts w:ascii="Times New Roman" w:hAnsi="Times New Roman" w:cs="Times New Roman"/>
+        </w:rPr>
+        <w:t>Simulated P(D</w:t>
       </w:r>
       <w:r>
         <w:rPr>
@@ -5517,7 +5576,7 @@
       </w:r>
       <w:r>
         <w:rPr>
-          <w:rFonts w:hint="eastAsia"/>
+          <w:rFonts w:ascii="Times New Roman" w:hAnsi="Times New Roman" w:cs="Times New Roman"/>
         </w:rPr>
         <w:t>T): 0.16141</w:t>
       </w:r>
@@ -5527,19 +5586,16 @@
         <w:pStyle w:val="ad"/>
         <w:kinsoku w:val="0"/>
         <w:spacing w:line="360" w:lineRule="auto"/>
-        <w:ind w:left="1080"/>
-        <w:rPr>
-          <w:rFonts w:eastAsiaTheme="minorEastAsia"/>
-        </w:rPr>
-      </w:pPr>
-      <w:r>
-        <w:t xml:space="preserve">Theoretical </w:t>
-      </w:r>
-      <w:r>
-        <w:rPr>
-          <w:rFonts w:hint="eastAsia"/>
-        </w:rPr>
-        <w:t>P(D</w:t>
+        <w:ind w:left="1080" w:firstLineChars="200" w:firstLine="420"/>
+        <w:rPr>
+          <w:rFonts w:ascii="Times New Roman" w:eastAsiaTheme="minorEastAsia" w:hAnsi="Times New Roman" w:cs="Times New Roman"/>
+        </w:rPr>
+      </w:pPr>
+      <w:r>
+        <w:rPr>
+          <w:rFonts w:ascii="Times New Roman" w:hAnsi="Times New Roman" w:cs="Times New Roman"/>
+        </w:rPr>
+        <w:t>Theoretical P(D</w:t>
       </w:r>
       <w:r>
         <w:rPr>
@@ -5549,7 +5605,7 @@
       </w:r>
       <w:r>
         <w:rPr>
-          <w:rFonts w:hint="eastAsia"/>
+          <w:rFonts w:ascii="Times New Roman" w:hAnsi="Times New Roman" w:cs="Times New Roman"/>
         </w:rPr>
         <w:t>T): 0.16102</w:t>
       </w:r>
@@ -5559,12 +5615,15 @@
         <w:pStyle w:val="ad"/>
         <w:kinsoku w:val="0"/>
         <w:spacing w:line="360" w:lineRule="auto"/>
-        <w:ind w:left="1080"/>
-        <w:rPr>
-          <w:rFonts w:eastAsiaTheme="minorEastAsia"/>
-        </w:rPr>
-      </w:pPr>
-      <w:r>
+        <w:ind w:left="1080" w:firstLineChars="200" w:firstLine="420"/>
+        <w:rPr>
+          <w:rFonts w:ascii="Times New Roman" w:eastAsiaTheme="minorEastAsia" w:hAnsi="Times New Roman" w:cs="Times New Roman"/>
+        </w:rPr>
+      </w:pPr>
+      <w:r>
+        <w:rPr>
+          <w:rFonts w:ascii="Times New Roman" w:hAnsi="Times New Roman" w:cs="Times New Roman"/>
+        </w:rPr>
         <w:t>The simulated value is very close to the theoretical value, so the simulation agrees with Bayes’ theorem.</w:t>
       </w:r>
     </w:p>
@@ -5573,13 +5632,16 @@
         <w:pStyle w:val="ad"/>
         <w:kinsoku w:val="0"/>
         <w:spacing w:line="360" w:lineRule="auto"/>
-        <w:ind w:left="1080"/>
+        <w:ind w:left="1080" w:firstLineChars="200" w:firstLine="420"/>
         <w:jc w:val="both"/>
         <w:rPr>
-          <w:rFonts w:eastAsiaTheme="minorEastAsia"/>
-        </w:rPr>
-      </w:pPr>
-      <w:r>
+          <w:rFonts w:ascii="Times New Roman" w:eastAsiaTheme="minorEastAsia" w:hAnsi="Times New Roman" w:cs="Times New Roman"/>
+        </w:rPr>
+      </w:pPr>
+      <w:r>
+        <w:rPr>
+          <w:rFonts w:ascii="Times New Roman" w:hAnsi="Times New Roman" w:cs="Times New Roman"/>
+        </w:rPr>
         <w:t>Although the test has 95% accuracy, a positive result does not mean the patient has a 95% chance of having the disease or dying. This is because the disease itself is rare, with only a 1% prior probability. Among a large number of healthy people, even a small false positive rate of 5% can still produce many positive test results. Therefore, after receiving a positive result, the actual probability is only about 16.1%, not 95%.</w:t>
       </w:r>
     </w:p>
@@ -5647,7 +5709,12 @@
         </w:rPr>
         <w:t xml:space="preserve"> </w:t>
       </w:r>
-      <w:r>
+    </w:p>
+    <w:p>
+      <w:pPr>
+        <w:snapToGrid w:val="0"/>
+        <w:spacing w:beforeLines="50" w:before="156" w:afterLines="50" w:after="156" w:line="360" w:lineRule="auto"/>
+        <w:ind w:firstLineChars="200" w:firstLine="420"/>
         <w:rPr>
           <w:rFonts w:ascii="Times New Roman" w:eastAsia="宋体" w:hAnsi="Times New Roman" w:cs="Times New Roman"/>
           <w:bCs/>
@@ -5655,6 +5722,15 @@
           <w:szCs w:val="21"/>
           <w:lang w:bidi="ar"/>
         </w:rPr>
+      </w:pPr>
+      <w:r>
+        <w:rPr>
+          <w:rFonts w:ascii="Times New Roman" w:eastAsia="宋体" w:hAnsi="Times New Roman" w:cs="Times New Roman"/>
+          <w:bCs/>
+          <w:color w:val="000000"/>
+          <w:szCs w:val="21"/>
+          <w:lang w:bidi="ar"/>
+        </w:rPr>
         <w:t xml:space="preserve">I learned how to use MATLAB to </w:t>
       </w:r>
       <w:r>
@@ -5808,8 +5884,22 @@
           <w:szCs w:val="21"/>
           <w:lang w:bidi="ar"/>
         </w:rPr>
-        <w:t xml:space="preserve"> To write this </w:t>
-      </w:r>
+        <w:t xml:space="preserve"> </w:t>
+      </w:r>
+    </w:p>
+    <w:p>
+      <w:pPr>
+        <w:snapToGrid w:val="0"/>
+        <w:spacing w:beforeLines="50" w:before="156" w:afterLines="50" w:after="156" w:line="360" w:lineRule="auto"/>
+        <w:ind w:firstLineChars="200" w:firstLine="420"/>
+        <w:rPr>
+          <w:rFonts w:ascii="Times New Roman" w:eastAsia="宋体" w:hAnsi="Times New Roman" w:cs="Times New Roman"/>
+          <w:bCs/>
+          <w:color w:val="000000"/>
+          <w:szCs w:val="21"/>
+          <w:lang w:bidi="ar"/>
+        </w:rPr>
+      </w:pPr>
       <w:r>
         <w:rPr>
           <w:rFonts w:ascii="Times New Roman" w:eastAsia="宋体" w:hAnsi="Times New Roman" w:cs="Times New Roman" w:hint="eastAsia"/>
@@ -5818,7 +5908,7 @@
           <w:szCs w:val="21"/>
           <w:lang w:bidi="ar"/>
         </w:rPr>
-        <w:t xml:space="preserve">experiment report, I learned how to </w:t>
+        <w:t xml:space="preserve">To write this </w:t>
       </w:r>
       <w:r>
         <w:rPr>
@@ -5828,7 +5918,7 @@
           <w:szCs w:val="21"/>
           <w:lang w:bidi="ar"/>
         </w:rPr>
-        <w:t>beautify the MATLAB codes in</w:t>
+        <w:t xml:space="preserve">experiment report, I learned how to </w:t>
       </w:r>
       <w:r>
         <w:rPr>
@@ -5838,7 +5928,7 @@
           <w:szCs w:val="21"/>
           <w:lang w:bidi="ar"/>
         </w:rPr>
-        <w:t xml:space="preserve"> Microsoft Word. According to the Internet, I </w:t>
+        <w:t>beautify the MATLAB codes in</w:t>
       </w:r>
       <w:r>
         <w:rPr>
@@ -5848,7 +5938,39 @@
           <w:szCs w:val="21"/>
           <w:lang w:bidi="ar"/>
         </w:rPr>
-        <w:t>saved my .m file</w:t>
+        <w:t xml:space="preserve"> Microsoft Word. According to the Internet, I </w:t>
+      </w:r>
+      <w:r>
+        <w:rPr>
+          <w:rFonts w:ascii="Times New Roman" w:eastAsia="宋体" w:hAnsi="Times New Roman" w:cs="Times New Roman" w:hint="eastAsia"/>
+          <w:bCs/>
+          <w:color w:val="000000"/>
+          <w:szCs w:val="21"/>
+          <w:lang w:bidi="ar"/>
+        </w:rPr>
+        <w:t xml:space="preserve">saved </w:t>
+      </w:r>
+      <w:proofErr w:type="gramStart"/>
+      <w:r>
+        <w:rPr>
+          <w:rFonts w:ascii="Times New Roman" w:eastAsia="宋体" w:hAnsi="Times New Roman" w:cs="Times New Roman" w:hint="eastAsia"/>
+          <w:bCs/>
+          <w:color w:val="000000"/>
+          <w:szCs w:val="21"/>
+          <w:lang w:bidi="ar"/>
+        </w:rPr>
+        <w:t>my</w:t>
+      </w:r>
+      <w:proofErr w:type="gramEnd"/>
+      <w:r>
+        <w:rPr>
+          <w:rFonts w:ascii="Times New Roman" w:eastAsia="宋体" w:hAnsi="Times New Roman" w:cs="Times New Roman" w:hint="eastAsia"/>
+          <w:bCs/>
+          <w:color w:val="000000"/>
+          <w:szCs w:val="21"/>
+          <w:lang w:bidi="ar"/>
+        </w:rPr>
+        <w:t xml:space="preserve"> .m file</w:t>
       </w:r>
       <w:r>
         <w:rPr>
@@ -6023,6 +6145,7 @@
       <w:pPr>
         <w:snapToGrid w:val="0"/>
         <w:spacing w:beforeLines="50" w:before="156" w:afterLines="50" w:after="156" w:line="360" w:lineRule="auto"/>
+        <w:ind w:firstLineChars="200" w:firstLine="420"/>
         <w:rPr>
           <w:rFonts w:ascii="Times New Roman" w:eastAsia="宋体" w:hAnsi="Times New Roman" w:cs="Times New Roman"/>
           <w:bCs/>
@@ -6149,7 +6272,29 @@
           <w:szCs w:val="21"/>
           <w:lang w:bidi="ar"/>
         </w:rPr>
-        <w:t xml:space="preserve"> So I </w:t>
+        <w:t xml:space="preserve"> </w:t>
+      </w:r>
+      <w:proofErr w:type="gramStart"/>
+      <w:r>
+        <w:rPr>
+          <w:rFonts w:ascii="Times New Roman" w:eastAsia="宋体" w:hAnsi="Times New Roman" w:cs="Times New Roman" w:hint="eastAsia"/>
+          <w:bCs/>
+          <w:color w:val="000000"/>
+          <w:szCs w:val="21"/>
+          <w:lang w:bidi="ar"/>
+        </w:rPr>
+        <w:t>So</w:t>
+      </w:r>
+      <w:proofErr w:type="gramEnd"/>
+      <w:r>
+        <w:rPr>
+          <w:rFonts w:ascii="Times New Roman" w:eastAsia="宋体" w:hAnsi="Times New Roman" w:cs="Times New Roman" w:hint="eastAsia"/>
+          <w:bCs/>
+          <w:color w:val="000000"/>
+          <w:szCs w:val="21"/>
+          <w:lang w:bidi="ar"/>
+        </w:rPr>
+        <w:t xml:space="preserve"> I </w:t>
       </w:r>
       <w:r>
         <w:rPr>
@@ -9457,10 +9602,6 @@
 </file>
 
 <file path=customXml/item1.xml><?xml version="1.0" encoding="utf-8"?>
-<b:Sources xmlns:b="http://schemas.openxmlformats.org/officeDocument/2006/bibliography" xmlns="http://schemas.openxmlformats.org/officeDocument/2006/bibliography" SelectedStyle="\APASixthEditionOfficeOnline.xsl" StyleName="APA" Version="6"/>
-</file>
-
-<file path=customXml/item2.xml><?xml version="1.0" encoding="utf-8"?>
 <s:customData xmlns="http://www.wps.cn/officeDocument/2013/wpsCustomData" xmlns:s="http://www.wps.cn/officeDocument/2013/wpsCustomData">
   <customSectProps>
     <customSectPr/>
@@ -9468,18 +9609,22 @@
 </s:customData>
 </file>
 
+<file path=customXml/item2.xml><?xml version="1.0" encoding="utf-8"?>
+<b:Sources xmlns:b="http://schemas.openxmlformats.org/officeDocument/2006/bibliography" xmlns="http://schemas.openxmlformats.org/officeDocument/2006/bibliography" SelectedStyle="\APASixthEditionOfficeOnline.xsl" StyleName="APA" Version="6"/>
+</file>
+
 <file path=customXml/itemProps1.xml><?xml version="1.0" encoding="utf-8"?>
+<ds:datastoreItem xmlns:ds="http://schemas.openxmlformats.org/officeDocument/2006/customXml" ds:itemID="{B1977F7D-205B-4081-913C-38D41E755F92}">
+  <ds:schemaRefs>
+    <ds:schemaRef ds:uri="http://www.wps.cn/officeDocument/2013/wpsCustomData"/>
+  </ds:schemaRefs>
+</ds:datastoreItem>
+</file>
+
+<file path=customXml/itemProps2.xml><?xml version="1.0" encoding="utf-8"?>
 <ds:datastoreItem xmlns:ds="http://schemas.openxmlformats.org/officeDocument/2006/customXml" ds:itemID="{9F17C21A-8659-4340-A392-A45763ECD409}">
   <ds:schemaRefs>
     <ds:schemaRef ds:uri="http://schemas.openxmlformats.org/officeDocument/2006/bibliography"/>
   </ds:schemaRefs>
 </ds:datastoreItem>
-</file>
-
-<file path=customXml/itemProps2.xml><?xml version="1.0" encoding="utf-8"?>
-<ds:datastoreItem xmlns:ds="http://schemas.openxmlformats.org/officeDocument/2006/customXml" ds:itemID="{B1977F7D-205B-4081-913C-38D41E755F92}">
-  <ds:schemaRefs>
-    <ds:schemaRef ds:uri="http://www.wps.cn/officeDocument/2013/wpsCustomData"/>
-  </ds:schemaRefs>
-</ds:datastoreItem>
 </file>
</xml_diff>